<commit_message>
Fix numbering indentation bug in KCB Group .docx export
The numbered Origination Angles list had no indentation defined in
numbering.xml (missing <w:ind>) and used a schema-inconsistent
alignment value (start vs. left used elsewhere), unlike the bullet
lists which had both. Lenient parsers (python-docx, mammoth) rendered
it fine, but it displayed as misaligned/overlapping numbers in
stricter viewers. Added matching indent and corrected alignment so the
numbered list renders consistently with the bulleted sections.

Co-Authored-By: Claude Sonnet 5 <noreply@anthropic.com>
Claude-Session: https://claude.ai/code/session_01FCqB4ijWrKJnK9BbvkaMH5
</commit_message>
<xml_diff>
--- a/coverage.os/kenya/banking-finance/kcb-group/2026-09-14_KCBGroup_prep.docx
+++ b/coverage.os/kenya/banking-finance/kcb-group/2026-09-14_KCBGroup_prep.docx
@@ -532,7 +532,7 @@
       <w:r>
         <w:t xml:space="preserve">The Kenyan Wallstreet, "KCB Q1 2026 Results: Profit Rises as Funding Costs Fall" (2026) — </w:t>
       </w:r>
-      <w:hyperlink w:history="1" r:id="rIdl73ta-eowambhddj37gjz">
+      <w:hyperlink w:history="1" r:id="rId7zxx3xttwealjpvyu7lcb">
         <w:r>
           <w:rPr>
             <w:color w:val="2563EB"/>
@@ -554,7 +554,7 @@
       <w:r>
         <w:t xml:space="preserve">Abojani, "KCB Group H1 2026: A Stronger Balance Sheet, 21% Rise in PBT and Higher Shareholder Returns" (12 Aug 2026) — </w:t>
       </w:r>
-      <w:hyperlink w:history="1" r:id="rIdvcyvz6xlv_pyb2gfvnc7q">
+      <w:hyperlink w:history="1" r:id="rIdcmnlmh1wuaycmeht6z_3s">
         <w:r>
           <w:rPr>
             <w:color w:val="2563EB"/>
@@ -576,7 +576,7 @@
       <w:r>
         <w:t xml:space="preserve">capmad.com, "Kenya: KCB lifts first-half net profit by 14.2% and raises interim dividend" (2026) — </w:t>
       </w:r>
-      <w:hyperlink w:history="1" r:id="rIdgyyjryvcc-rvbr-imlzre">
+      <w:hyperlink w:history="1" r:id="rIdsrucn2tqoes12zzi0dmn_">
         <w:r>
           <w:rPr>
             <w:color w:val="2563EB"/>
@@ -598,7 +598,7 @@
       <w:r>
         <w:t xml:space="preserve">The EastAfrican, "KCB identifies entity for 2026 Ethiopia entry" (2026) — </w:t>
       </w:r>
-      <w:hyperlink w:history="1" r:id="rIdfqlhz5pi_daohgpj_xcj6">
+      <w:hyperlink w:history="1" r:id="rIdy7hwv1kmtxrqgjfd2qqtf">
         <w:r>
           <w:rPr>
             <w:color w:val="2563EB"/>
@@ -620,7 +620,7 @@
       <w:r>
         <w:t xml:space="preserve">The Africa Report, "KCB's Ethiopia expansion hits roadblocks over share pricing and foreign stake caps" (2026) — </w:t>
       </w:r>
-      <w:hyperlink w:history="1" r:id="rIdvwmzuaj1trgj8ohnzqanf">
+      <w:hyperlink w:history="1" r:id="rIdrkarfxkzwmdwebk7dsirb">
         <w:r>
           <w:rPr>
             <w:color w:val="2563EB"/>
@@ -642,7 +642,7 @@
       <w:r>
         <w:t xml:space="preserve">The Africa Report, "KCB's Russo 'eager to play' in Ethiopian market, despite 49% cap on foreign banks" (2026) — </w:t>
       </w:r>
-      <w:hyperlink w:history="1" r:id="rId9ala33w-5agwty4rwvrz4">
+      <w:hyperlink w:history="1" r:id="rIdetxp4zavc252mczcz3p9q">
         <w:r>
           <w:rPr>
             <w:color w:val="2563EB"/>
@@ -664,7 +664,7 @@
       <w:r>
         <w:t xml:space="preserve">KCB Group / Access Bank, "KCB Group Plc &amp; Access Bank Plc Complete National Bank of Kenya (NBK) Transaction" — </w:t>
       </w:r>
-      <w:hyperlink w:history="1" r:id="rIdkll2hwkm7naizhuejbqpa">
+      <w:hyperlink w:history="1" r:id="rIdef5ftlrn7s3--e7dayozd">
         <w:r>
           <w:rPr>
             <w:color w:val="2563EB"/>
@@ -686,7 +686,7 @@
       <w:r>
         <w:t xml:space="preserve">Business Daily, "KCB Group books Sh3.1bn gain from sale of National Bank" — </w:t>
       </w:r>
-      <w:hyperlink w:history="1" r:id="rIdwig98xfkhnyw3bhrry2-z">
+      <w:hyperlink w:history="1" r:id="rIdovznb3sgjlk8sk4zwwzjz">
         <w:r>
           <w:rPr>
             <w:color w:val="2563EB"/>
@@ -708,7 +708,7 @@
       <w:r>
         <w:t xml:space="preserve">Rio Times, "KCB Sh300 Billion Sustainability Bond Programme in October 2026" — </w:t>
       </w:r>
-      <w:hyperlink w:history="1" r:id="rIdemwj0kzkp4oneqqtedfxn">
+      <w:hyperlink w:history="1" r:id="rId6mwx_mwtab3s8hclq-q3m">
         <w:r>
           <w:rPr>
             <w:color w:val="2563EB"/>
@@ -730,7 +730,7 @@
       <w:r>
         <w:t xml:space="preserve">Digital Banking News, "Equity Group, KCB Secure DRC Banking Rule Exemptions, Retain Stakes in Subsidiaries" — </w:t>
       </w:r>
-      <w:hyperlink w:history="1" r:id="rIdernohysy4y6adnc11umij">
+      <w:hyperlink w:history="1" r:id="rIdf9u5kwkrnaf9lzb2aci1m">
         <w:r>
           <w:rPr>
             <w:color w:val="2563EB"/>
@@ -752,7 +752,7 @@
       <w:r>
         <w:t xml:space="preserve">Finance in Africa, "Kenya's banking giants face $388M divestment as the DRC demands local ownership" — </w:t>
       </w:r>
-      <w:hyperlink w:history="1" r:id="rIds17dqtj1s_jvhkkzq4jof">
+      <w:hyperlink w:history="1" r:id="rIdoyou4yhyqco4nmg_auinf">
         <w:r>
           <w:rPr>
             <w:color w:val="2563EB"/>
@@ -774,7 +774,7 @@
       <w:r>
         <w:t xml:space="preserve">Financial Afrik, "Moody's upgrades Kenya's sovereign rating to 'B3', driven by strengthening foreign exchange reserves" (31 Jan 2026) — </w:t>
       </w:r>
-      <w:hyperlink w:history="1" r:id="rIdmlj4hnkofhzl3za3olg20">
+      <w:hyperlink w:history="1" r:id="rIdavmh-64e1atrkw3rwyyu7">
         <w:r>
           <w:rPr>
             <w:color w:val="2563EB"/>
@@ -796,7 +796,7 @@
       <w:r>
         <w:t xml:space="preserve">Kenyan Wallstreet (X/Twitter), Moody's Kenya sovereign rating history — </w:t>
       </w:r>
-      <w:hyperlink w:history="1" r:id="rIda3mrdrbovn0gljc4ywbo_">
+      <w:hyperlink w:history="1" r:id="rIdziyahtopat4mogthmnzzg">
         <w:r>
           <w:rPr>
             <w:color w:val="2563EB"/>
@@ -818,7 +818,7 @@
       <w:r>
         <w:t xml:space="preserve">The Star, "Moody's upgrades outlook for Kenyan banks on interest rates fall" (9 Feb 2026) — </w:t>
       </w:r>
-      <w:hyperlink w:history="1" r:id="rIdm2jxxddg3b7l47s1_xbo4">
+      <w:hyperlink w:history="1" r:id="rIddafb7o1wqex9jaxcocmji">
         <w:r>
           <w:rPr>
             <w:color w:val="2563EB"/>
@@ -840,7 +840,7 @@
       <w:r>
         <w:t xml:space="preserve">Bizna Kenya, "Is the strong H1 performance by banking sector sustainable?" (2026) — </w:t>
       </w:r>
-      <w:hyperlink w:history="1" r:id="rIdkv5zy_j3m2vqkadaw0cnw">
+      <w:hyperlink w:history="1" r:id="rIdverzhcmdb546tbmqv_xfu">
         <w:r>
           <w:rPr>
             <w:color w:val="2563EB"/>
@@ -862,7 +862,7 @@
       <w:r>
         <w:t xml:space="preserve">Business Daily, "Why World Bank sees new Kenya's forex reserves pressure" (2026) — </w:t>
       </w:r>
-      <w:hyperlink w:history="1" r:id="rIdlzbl1gf3s6elawxjeqdwg">
+      <w:hyperlink w:history="1" r:id="rIdsq5oqllll6j8a_ykg7-ys">
         <w:r>
           <w:rPr>
             <w:color w:val="2563EB"/>
@@ -884,7 +884,7 @@
       <w:r>
         <w:t xml:space="preserve">The Star, "Kenya's forex reserves set for record Sh2.1 trillion as CBK strengthens Shilling defence" (16 Jul 2026) — </w:t>
       </w:r>
-      <w:hyperlink w:history="1" r:id="rIdpgyis6jqgx4xauudrjhrj">
+      <w:hyperlink w:history="1" r:id="rId9qryivivztudslra5coa-">
         <w:r>
           <w:rPr>
             <w:color w:val="2563EB"/>
@@ -906,7 +906,7 @@
       <w:r>
         <w:t xml:space="preserve">TechTrendsKE, "CBK proposes additional capital and supervision requirements for Kenya's biggest banking institutions" (13 Sep 2026) — </w:t>
       </w:r>
-      <w:hyperlink w:history="1" r:id="rIdpnxlila0xv053pk0xyw7k">
+      <w:hyperlink w:history="1" r:id="rIduf71mxvxaskhyadcgdpef">
         <w:r>
           <w:rPr>
             <w:color w:val="2563EB"/>
@@ -928,7 +928,7 @@
       <w:r>
         <w:t xml:space="preserve">Central Bank of Kenya, "Kenya Financial Sector Stability Report 2024" — </w:t>
       </w:r>
-      <w:hyperlink w:history="1" r:id="rIdcjn8qvoghz8wlkxfjryjx">
+      <w:hyperlink w:history="1" r:id="rIdd10bcilzat87dwxp9wdvl">
         <w:r>
           <w:rPr>
             <w:color w:val="2563EB"/>
@@ -1118,7 +1118,10 @@
       <w:start w:val="1"/>
       <w:numFmt w:val="decimal"/>
       <w:lvlText w:val="%1."/>
-      <w:lvlJc w:val="start"/>
+      <w:lvlJc w:val="left"/>
+      <w:pPr>
+        <w:ind w:left="720" w:hanging="360"/>
+      </w:pPr>
     </w:lvl>
   </w:abstractNum>
   <w:num w:numId="1">

</xml_diff>